<commit_message>
Alterações no crud de clientes
</commit_message>
<xml_diff>
--- a/ERS/ERS - Meuatrix.docx
+++ b/ERS/ERS - Meuatrix.docx
@@ -4895,11 +4895,51 @@
           </w:tcPr>
           <w:p>
             <w:pPr>
-              <w:jc w:val="center"/>
-              <w:rPr>
-                <w:rFonts w:asciiTheme="minorHAnsi" w:hAnsiTheme="minorHAnsi" w:cstheme="minorHAnsi"/>
-              </w:rPr>
-            </w:pPr>
+              <w:jc w:val="left"/>
+              <w:rPr>
+                <w:rFonts w:asciiTheme="minorHAnsi" w:hAnsiTheme="minorHAnsi" w:cstheme="minorHAnsi"/>
+              </w:rPr>
+            </w:pPr>
+            <w:r>
+              <w:rPr>
+                <w:rFonts w:asciiTheme="minorHAnsi" w:hAnsiTheme="minorHAnsi" w:cstheme="minorHAnsi"/>
+              </w:rPr>
+              <w:t>Erro ao gravar</w:t>
+            </w:r>
+            <w:r>
+              <w:rPr>
+                <w:rFonts w:asciiTheme="minorHAnsi" w:hAnsiTheme="minorHAnsi" w:cstheme="minorHAnsi"/>
+              </w:rPr>
+              <w:br/>
+            </w:r>
+            <w:proofErr w:type="spellStart"/>
+            <w:r>
+              <w:rPr>
+                <w:rFonts w:asciiTheme="minorHAnsi" w:hAnsiTheme="minorHAnsi" w:cstheme="minorHAnsi"/>
+              </w:rPr>
+              <w:t>Invalid</w:t>
+            </w:r>
+            <w:proofErr w:type="spellEnd"/>
+            <w:r>
+              <w:rPr>
+                <w:rFonts w:asciiTheme="minorHAnsi" w:hAnsiTheme="minorHAnsi" w:cstheme="minorHAnsi"/>
+              </w:rPr>
+              <w:t xml:space="preserve"> input</w:t>
+            </w:r>
+            <w:r>
+              <w:rPr>
+                <w:rFonts w:asciiTheme="minorHAnsi" w:hAnsiTheme="minorHAnsi" w:cstheme="minorHAnsi"/>
+              </w:rPr>
+              <w:br/>
+              <w:t>Campos obrigatórios</w:t>
+            </w:r>
+            <w:r>
+              <w:rPr>
+                <w:rFonts w:asciiTheme="minorHAnsi" w:hAnsiTheme="minorHAnsi" w:cstheme="minorHAnsi"/>
+              </w:rPr>
+              <w:br/>
+              <w:t>Não duplicar descrição</w:t>
+            </w:r>
           </w:p>
         </w:tc>
         <w:tc>
@@ -5028,11 +5068,38 @@
           </w:tcPr>
           <w:p>
             <w:pPr>
-              <w:jc w:val="center"/>
-              <w:rPr>
-                <w:rFonts w:asciiTheme="minorHAnsi" w:hAnsiTheme="minorHAnsi" w:cstheme="minorHAnsi"/>
-              </w:rPr>
-            </w:pPr>
+              <w:jc w:val="left"/>
+              <w:rPr>
+                <w:rFonts w:asciiTheme="minorHAnsi" w:hAnsiTheme="minorHAnsi" w:cstheme="minorHAnsi"/>
+              </w:rPr>
+            </w:pPr>
+            <w:proofErr w:type="spellStart"/>
+            <w:r>
+              <w:rPr>
+                <w:rFonts w:asciiTheme="minorHAnsi" w:hAnsiTheme="minorHAnsi" w:cstheme="minorHAnsi"/>
+              </w:rPr>
+              <w:t>Invalid</w:t>
+            </w:r>
+            <w:proofErr w:type="spellEnd"/>
+            <w:r>
+              <w:rPr>
+                <w:rFonts w:asciiTheme="minorHAnsi" w:hAnsiTheme="minorHAnsi" w:cstheme="minorHAnsi"/>
+              </w:rPr>
+              <w:t xml:space="preserve"> input</w:t>
+            </w:r>
+            <w:r>
+              <w:rPr>
+                <w:rFonts w:asciiTheme="minorHAnsi" w:hAnsiTheme="minorHAnsi" w:cstheme="minorHAnsi"/>
+              </w:rPr>
+              <w:br/>
+              <w:t>Campos obrigatórios</w:t>
+            </w:r>
+            <w:r>
+              <w:rPr>
+                <w:rFonts w:asciiTheme="minorHAnsi" w:hAnsiTheme="minorHAnsi" w:cstheme="minorHAnsi"/>
+              </w:rPr>
+              <w:br/>
+            </w:r>
           </w:p>
         </w:tc>
         <w:tc>
@@ -5168,11 +5235,32 @@
           </w:tcPr>
           <w:p>
             <w:pPr>
-              <w:jc w:val="center"/>
-              <w:rPr>
-                <w:rFonts w:asciiTheme="minorHAnsi" w:hAnsiTheme="minorHAnsi" w:cstheme="minorHAnsi"/>
-              </w:rPr>
-            </w:pPr>
+              <w:jc w:val="left"/>
+              <w:rPr>
+                <w:rFonts w:asciiTheme="minorHAnsi" w:hAnsiTheme="minorHAnsi" w:cstheme="minorHAnsi"/>
+              </w:rPr>
+            </w:pPr>
+            <w:proofErr w:type="spellStart"/>
+            <w:r>
+              <w:rPr>
+                <w:rFonts w:asciiTheme="minorHAnsi" w:hAnsiTheme="minorHAnsi" w:cstheme="minorHAnsi"/>
+              </w:rPr>
+              <w:t>Invalid</w:t>
+            </w:r>
+            <w:proofErr w:type="spellEnd"/>
+            <w:r>
+              <w:rPr>
+                <w:rFonts w:asciiTheme="minorHAnsi" w:hAnsiTheme="minorHAnsi" w:cstheme="minorHAnsi"/>
+              </w:rPr>
+              <w:t xml:space="preserve"> input</w:t>
+            </w:r>
+            <w:r>
+              <w:rPr>
+                <w:rFonts w:asciiTheme="minorHAnsi" w:hAnsiTheme="minorHAnsi" w:cstheme="minorHAnsi"/>
+              </w:rPr>
+              <w:br/>
+              <w:t>Campos obrigatórios</w:t>
+            </w:r>
           </w:p>
         </w:tc>
         <w:tc>
@@ -5301,11 +5389,50 @@
           </w:tcPr>
           <w:p>
             <w:pPr>
-              <w:jc w:val="center"/>
-              <w:rPr>
-                <w:rFonts w:asciiTheme="minorHAnsi" w:hAnsiTheme="minorHAnsi" w:cstheme="minorHAnsi"/>
-              </w:rPr>
-            </w:pPr>
+              <w:jc w:val="left"/>
+              <w:rPr>
+                <w:rFonts w:asciiTheme="minorHAnsi" w:hAnsiTheme="minorHAnsi" w:cstheme="minorHAnsi"/>
+              </w:rPr>
+            </w:pPr>
+            <w:r>
+              <w:rPr>
+                <w:rFonts w:asciiTheme="minorHAnsi" w:hAnsiTheme="minorHAnsi" w:cstheme="minorHAnsi"/>
+              </w:rPr>
+              <w:br/>
+            </w:r>
+            <w:proofErr w:type="spellStart"/>
+            <w:r>
+              <w:rPr>
+                <w:rFonts w:asciiTheme="minorHAnsi" w:hAnsiTheme="minorHAnsi" w:cstheme="minorHAnsi"/>
+              </w:rPr>
+              <w:t>Invalid</w:t>
+            </w:r>
+            <w:proofErr w:type="spellEnd"/>
+            <w:r>
+              <w:rPr>
+                <w:rFonts w:asciiTheme="minorHAnsi" w:hAnsiTheme="minorHAnsi" w:cstheme="minorHAnsi"/>
+              </w:rPr>
+              <w:t xml:space="preserve"> input</w:t>
+            </w:r>
+            <w:r>
+              <w:rPr>
+                <w:rFonts w:asciiTheme="minorHAnsi" w:hAnsiTheme="minorHAnsi" w:cstheme="minorHAnsi"/>
+              </w:rPr>
+              <w:br/>
+              <w:t>Campos obrigatórios</w:t>
+            </w:r>
+            <w:r>
+              <w:rPr>
+                <w:rFonts w:asciiTheme="minorHAnsi" w:hAnsiTheme="minorHAnsi" w:cstheme="minorHAnsi"/>
+              </w:rPr>
+              <w:br/>
+            </w:r>
+            <w:r>
+              <w:rPr>
+                <w:rFonts w:asciiTheme="minorHAnsi" w:hAnsiTheme="minorHAnsi" w:cstheme="minorHAnsi"/>
+              </w:rPr>
+              <w:t>Validar CNPJ</w:t>
+            </w:r>
           </w:p>
         </w:tc>
         <w:tc>
@@ -5434,11 +5561,39 @@
           </w:tcPr>
           <w:p>
             <w:pPr>
-              <w:jc w:val="center"/>
-              <w:rPr>
-                <w:rFonts w:asciiTheme="minorHAnsi" w:hAnsiTheme="minorHAnsi" w:cstheme="minorHAnsi"/>
-              </w:rPr>
-            </w:pPr>
+              <w:jc w:val="left"/>
+              <w:rPr>
+                <w:rFonts w:asciiTheme="minorHAnsi" w:hAnsiTheme="minorHAnsi" w:cstheme="minorHAnsi"/>
+              </w:rPr>
+            </w:pPr>
+            <w:proofErr w:type="spellStart"/>
+            <w:r>
+              <w:rPr>
+                <w:rFonts w:asciiTheme="minorHAnsi" w:hAnsiTheme="minorHAnsi" w:cstheme="minorHAnsi"/>
+              </w:rPr>
+              <w:t>Invalid</w:t>
+            </w:r>
+            <w:proofErr w:type="spellEnd"/>
+            <w:r>
+              <w:rPr>
+                <w:rFonts w:asciiTheme="minorHAnsi" w:hAnsiTheme="minorHAnsi" w:cstheme="minorHAnsi"/>
+              </w:rPr>
+              <w:t xml:space="preserve"> input</w:t>
+            </w:r>
+            <w:r>
+              <w:rPr>
+                <w:rFonts w:asciiTheme="minorHAnsi" w:hAnsiTheme="minorHAnsi" w:cstheme="minorHAnsi"/>
+              </w:rPr>
+              <w:br/>
+              <w:t>Campos obrigatórios</w:t>
+            </w:r>
+            <w:r>
+              <w:rPr>
+                <w:rFonts w:asciiTheme="minorHAnsi" w:hAnsiTheme="minorHAnsi" w:cstheme="minorHAnsi"/>
+              </w:rPr>
+              <w:br/>
+              <w:t>Novos campos</w:t>
+            </w:r>
           </w:p>
         </w:tc>
         <w:tc>
@@ -5567,16 +5722,37 @@
           </w:tcPr>
           <w:p>
             <w:pPr>
-              <w:jc w:val="center"/>
-              <w:rPr>
-                <w:rFonts w:asciiTheme="minorHAnsi" w:hAnsiTheme="minorHAnsi" w:cstheme="minorHAnsi"/>
-              </w:rPr>
-            </w:pPr>
-            <w:r>
-              <w:rPr>
-                <w:rFonts w:asciiTheme="minorHAnsi" w:hAnsiTheme="minorHAnsi" w:cstheme="minorHAnsi"/>
-              </w:rPr>
-              <w:t>Ajustes de validação e persistência de registro</w:t>
+              <w:jc w:val="left"/>
+              <w:rPr>
+                <w:rFonts w:asciiTheme="minorHAnsi" w:hAnsiTheme="minorHAnsi" w:cstheme="minorHAnsi"/>
+              </w:rPr>
+            </w:pPr>
+            <w:proofErr w:type="spellStart"/>
+            <w:r>
+              <w:rPr>
+                <w:rFonts w:asciiTheme="minorHAnsi" w:hAnsiTheme="minorHAnsi" w:cstheme="minorHAnsi"/>
+              </w:rPr>
+              <w:t>Invalid</w:t>
+            </w:r>
+            <w:proofErr w:type="spellEnd"/>
+            <w:r>
+              <w:rPr>
+                <w:rFonts w:asciiTheme="minorHAnsi" w:hAnsiTheme="minorHAnsi" w:cstheme="minorHAnsi"/>
+              </w:rPr>
+              <w:t xml:space="preserve"> </w:t>
+            </w:r>
+            <w:r>
+              <w:rPr>
+                <w:rFonts w:asciiTheme="minorHAnsi" w:hAnsiTheme="minorHAnsi" w:cstheme="minorHAnsi"/>
+              </w:rPr>
+              <w:t>input</w:t>
+            </w:r>
+            <w:r>
+              <w:rPr>
+                <w:rFonts w:asciiTheme="minorHAnsi" w:hAnsiTheme="minorHAnsi" w:cstheme="minorHAnsi"/>
+              </w:rPr>
+              <w:br/>
+              <w:t>Campos obrigatórios</w:t>
             </w:r>
           </w:p>
         </w:tc>
@@ -5713,11 +5889,17 @@
           </w:tcPr>
           <w:p>
             <w:pPr>
-              <w:jc w:val="center"/>
-              <w:rPr>
-                <w:rFonts w:asciiTheme="minorHAnsi" w:hAnsiTheme="minorHAnsi" w:cstheme="minorHAnsi"/>
-              </w:rPr>
-            </w:pPr>
+              <w:jc w:val="left"/>
+              <w:rPr>
+                <w:rFonts w:asciiTheme="minorHAnsi" w:hAnsiTheme="minorHAnsi" w:cstheme="minorHAnsi"/>
+              </w:rPr>
+            </w:pPr>
+            <w:r>
+              <w:rPr>
+                <w:rFonts w:asciiTheme="minorHAnsi" w:hAnsiTheme="minorHAnsi" w:cstheme="minorHAnsi"/>
+              </w:rPr>
+              <w:t>Validações sobre datas e quantidades</w:t>
+            </w:r>
           </w:p>
         </w:tc>
         <w:tc>
@@ -5731,6 +5913,12 @@
                 <w:rFonts w:asciiTheme="minorHAnsi" w:hAnsiTheme="minorHAnsi" w:cstheme="minorHAnsi"/>
               </w:rPr>
             </w:pPr>
+            <w:r>
+              <w:rPr>
+                <w:rFonts w:asciiTheme="minorHAnsi" w:hAnsiTheme="minorHAnsi" w:cstheme="minorHAnsi"/>
+              </w:rPr>
+              <w:t>S2</w:t>
+            </w:r>
           </w:p>
         </w:tc>
       </w:tr>
@@ -9968,7 +10156,7 @@
                 <w:sz w:val="22"/>
               </w:rPr>
               <w:drawing>
-                <wp:inline distT="0" distB="0" distL="0" distR="0" wp14:anchorId="5D21E18F" wp14:editId="73828B6A">
+                <wp:inline distT="0" distB="0" distL="0" distR="0" wp14:anchorId="5D21E18F" wp14:editId="6A6D0313">
                   <wp:extent cx="5424308" cy="2562861"/>
                   <wp:effectExtent l="0" t="0" r="5080" b="8890"/>
                   <wp:docPr id="1409173747" name="Imagem 5"/>
@@ -12285,7 +12473,7 @@
                 <w:noProof/>
               </w:rPr>
               <w:drawing>
-                <wp:inline distT="0" distB="0" distL="0" distR="0" wp14:anchorId="7292B2C4" wp14:editId="2AE021EF">
+                <wp:inline distT="0" distB="0" distL="0" distR="0" wp14:anchorId="7292B2C4" wp14:editId="4281036B">
                   <wp:extent cx="5343821" cy="2498763"/>
                   <wp:effectExtent l="0" t="0" r="9525" b="0"/>
                   <wp:docPr id="2011314755" name="Imagem 5"/>
@@ -14417,7 +14605,7 @@
                 <w:noProof/>
               </w:rPr>
               <w:drawing>
-                <wp:inline distT="0" distB="0" distL="0" distR="0" wp14:anchorId="335E3FD6" wp14:editId="5FA07CC9">
+                <wp:inline distT="0" distB="0" distL="0" distR="0" wp14:anchorId="335E3FD6" wp14:editId="357AC915">
                   <wp:extent cx="5946233" cy="2406484"/>
                   <wp:effectExtent l="0" t="0" r="0" b="0"/>
                   <wp:docPr id="32953469" name="Imagem 6"/>
@@ -14812,10 +15000,9 @@
             </w:pPr>
             <w:r>
               <w:rPr>
-                <w:rFonts w:asciiTheme="minorHAnsi" w:hAnsiTheme="minorHAnsi" w:cstheme="minorHAnsi"/>
-                <w:bCs/>
-                <w:sz w:val="22"/>
-                <w:szCs w:val="22"/>
+                <w:rFonts w:cstheme="minorHAnsi"/>
+                <w:bCs/>
+                <w:noProof/>
               </w:rPr>
               <w:drawing>
                 <wp:inline distT="0" distB="0" distL="0" distR="0" wp14:anchorId="27BC7D83" wp14:editId="104EA6CF">
@@ -16753,7 +16940,7 @@
                 <w:noProof/>
               </w:rPr>
               <w:drawing>
-                <wp:inline distT="0" distB="0" distL="0" distR="0" wp14:anchorId="7568263A" wp14:editId="06149B8F">
+                <wp:inline distT="0" distB="0" distL="0" distR="0" wp14:anchorId="7568263A" wp14:editId="7BA2F415">
                   <wp:extent cx="5517374" cy="3180604"/>
                   <wp:effectExtent l="0" t="0" r="7620" b="1270"/>
                   <wp:docPr id="560826634" name="Imagem 5"/>
@@ -20225,13 +20412,12 @@
             </w:pPr>
             <w:r>
               <w:rPr>
-                <w:rFonts w:asciiTheme="minorHAnsi" w:hAnsiTheme="minorHAnsi" w:cstheme="minorHAnsi"/>
+                <w:rFonts w:cstheme="minorHAnsi"/>
                 <w:noProof/>
                 <w:sz w:val="22"/>
-                <w:szCs w:val="22"/>
               </w:rPr>
               <w:drawing>
-                <wp:inline distT="0" distB="0" distL="0" distR="0" wp14:anchorId="187DB160" wp14:editId="4FE05F82">
+                <wp:inline distT="0" distB="0" distL="0" distR="0" wp14:anchorId="187DB160" wp14:editId="78BCBCC6">
                   <wp:extent cx="5502303" cy="2119389"/>
                   <wp:effectExtent l="0" t="0" r="3175" b="0"/>
                   <wp:docPr id="1892549414" name="Imagem 5"/>
@@ -20328,9 +20514,9 @@
             </w:pPr>
             <w:r>
               <w:rPr>
-                <w:rFonts w:asciiTheme="minorHAnsi" w:hAnsiTheme="minorHAnsi" w:cstheme="minorHAnsi"/>
-                <w:sz w:val="22"/>
-                <w:szCs w:val="22"/>
+                <w:rFonts w:cstheme="minorHAnsi"/>
+                <w:noProof/>
+                <w:sz w:val="22"/>
               </w:rPr>
               <w:drawing>
                 <wp:inline distT="0" distB="0" distL="0" distR="0" wp14:anchorId="542A89EE" wp14:editId="7EFA6399">
@@ -20431,10 +20617,9 @@
             </w:pPr>
             <w:r>
               <w:rPr>
-                <w:rFonts w:asciiTheme="minorHAnsi" w:hAnsiTheme="minorHAnsi" w:cstheme="minorHAnsi"/>
-                <w:bCs/>
-                <w:sz w:val="22"/>
-                <w:szCs w:val="22"/>
+                <w:rFonts w:cstheme="minorHAnsi"/>
+                <w:bCs/>
+                <w:noProof/>
               </w:rPr>
               <w:drawing>
                 <wp:inline distT="0" distB="0" distL="0" distR="0" wp14:anchorId="338CFE5F" wp14:editId="03778E9B">
@@ -20534,10 +20719,9 @@
             </w:pPr>
             <w:r>
               <w:rPr>
-                <w:rFonts w:asciiTheme="minorHAnsi" w:hAnsiTheme="minorHAnsi" w:cstheme="minorHAnsi"/>
-                <w:bCs/>
-                <w:sz w:val="22"/>
-                <w:szCs w:val="22"/>
+                <w:rFonts w:cstheme="minorHAnsi"/>
+                <w:bCs/>
+                <w:noProof/>
               </w:rPr>
               <w:lastRenderedPageBreak/>
               <w:drawing>
@@ -20619,10 +20803,9 @@
             </w:pPr>
             <w:r>
               <w:rPr>
-                <w:rFonts w:asciiTheme="minorHAnsi" w:hAnsiTheme="minorHAnsi" w:cstheme="minorHAnsi"/>
-                <w:bCs/>
-                <w:sz w:val="22"/>
-                <w:szCs w:val="22"/>
+                <w:rFonts w:cstheme="minorHAnsi"/>
+                <w:bCs/>
+                <w:noProof/>
               </w:rPr>
               <w:drawing>
                 <wp:inline distT="0" distB="0" distL="0" distR="0" wp14:anchorId="446CA709" wp14:editId="22372209">
@@ -20712,11 +20895,9 @@
             </w:r>
             <w:r>
               <w:rPr>
-                <w:rFonts w:asciiTheme="minorHAnsi" w:hAnsiTheme="minorHAnsi" w:cstheme="minorHAnsi"/>
+                <w:rFonts w:cstheme="minorHAnsi"/>
                 <w:bCs/>
                 <w:noProof/>
-                <w:sz w:val="22"/>
-                <w:szCs w:val="22"/>
               </w:rPr>
               <w:drawing>
                 <wp:inline distT="0" distB="0" distL="0" distR="0" wp14:anchorId="15B382D5" wp14:editId="22AEE658">
@@ -20824,34 +21005,7 @@
                 <w:sz w:val="22"/>
                 <w:szCs w:val="22"/>
               </w:rPr>
-              <w:t>itens</w:t>
-            </w:r>
-            <w:r>
-              <w:rPr>
-                <w:rFonts w:asciiTheme="minorHAnsi" w:hAnsiTheme="minorHAnsi" w:cstheme="minorHAnsi"/>
-                <w:b/>
-                <w:sz w:val="22"/>
-                <w:szCs w:val="22"/>
-              </w:rPr>
-              <w:t xml:space="preserve"> (RF_B</w:t>
-            </w:r>
-            <w:r>
-              <w:rPr>
-                <w:rFonts w:asciiTheme="minorHAnsi" w:hAnsiTheme="minorHAnsi" w:cstheme="minorHAnsi"/>
-                <w:b/>
-                <w:sz w:val="22"/>
-                <w:szCs w:val="22"/>
-              </w:rPr>
-              <w:t>8</w:t>
-            </w:r>
-            <w:r>
-              <w:rPr>
-                <w:rFonts w:asciiTheme="minorHAnsi" w:hAnsiTheme="minorHAnsi" w:cstheme="minorHAnsi"/>
-                <w:b/>
-                <w:sz w:val="22"/>
-                <w:szCs w:val="22"/>
-              </w:rPr>
-              <w:t>)</w:t>
+              <w:t>itens (RF_B8)</w:t>
             </w:r>
           </w:p>
           <w:p>
@@ -21997,13 +22151,12 @@
             </w:pPr>
             <w:r>
               <w:rPr>
-                <w:rFonts w:asciiTheme="minorHAnsi" w:hAnsiTheme="minorHAnsi" w:cstheme="minorHAnsi"/>
+                <w:rFonts w:cstheme="minorHAnsi"/>
                 <w:noProof/>
                 <w:sz w:val="22"/>
-                <w:szCs w:val="22"/>
               </w:rPr>
               <w:drawing>
-                <wp:inline distT="0" distB="0" distL="0" distR="0" wp14:anchorId="49AEA879" wp14:editId="516D04B5">
+                <wp:inline distT="0" distB="0" distL="0" distR="0" wp14:anchorId="49AEA879" wp14:editId="53302308">
                   <wp:extent cx="5316368" cy="3422512"/>
                   <wp:effectExtent l="0" t="0" r="0" b="6985"/>
                   <wp:docPr id="1264191746" name="Imagem 7"/>
@@ -22083,9 +22236,9 @@
             </w:pPr>
             <w:r>
               <w:rPr>
-                <w:rFonts w:asciiTheme="minorHAnsi" w:hAnsiTheme="minorHAnsi" w:cstheme="minorHAnsi"/>
-                <w:sz w:val="22"/>
-                <w:szCs w:val="22"/>
+                <w:rFonts w:cstheme="minorHAnsi"/>
+                <w:noProof/>
+                <w:sz w:val="22"/>
               </w:rPr>
               <w:lastRenderedPageBreak/>
               <w:drawing>
@@ -22187,10 +22340,9 @@
             </w:pPr>
             <w:r>
               <w:rPr>
-                <w:rFonts w:asciiTheme="minorHAnsi" w:hAnsiTheme="minorHAnsi" w:cstheme="minorHAnsi"/>
-                <w:bCs/>
-                <w:sz w:val="22"/>
-                <w:szCs w:val="22"/>
+                <w:rFonts w:cstheme="minorHAnsi"/>
+                <w:bCs/>
+                <w:noProof/>
               </w:rPr>
               <w:drawing>
                 <wp:inline distT="0" distB="0" distL="0" distR="0" wp14:anchorId="1B866916" wp14:editId="4BD2D7C2">
@@ -22271,10 +22423,9 @@
             </w:pPr>
             <w:r>
               <w:rPr>
-                <w:rFonts w:asciiTheme="minorHAnsi" w:hAnsiTheme="minorHAnsi" w:cstheme="minorHAnsi"/>
-                <w:bCs/>
-                <w:sz w:val="22"/>
-                <w:szCs w:val="22"/>
+                <w:rFonts w:cstheme="minorHAnsi"/>
+                <w:bCs/>
+                <w:noProof/>
               </w:rPr>
               <w:lastRenderedPageBreak/>
               <w:drawing>
@@ -22356,10 +22507,9 @@
             </w:pPr>
             <w:r>
               <w:rPr>
-                <w:rFonts w:asciiTheme="minorHAnsi" w:hAnsiTheme="minorHAnsi" w:cstheme="minorHAnsi"/>
-                <w:bCs/>
-                <w:sz w:val="22"/>
-                <w:szCs w:val="22"/>
+                <w:rFonts w:cstheme="minorHAnsi"/>
+                <w:bCs/>
+                <w:noProof/>
               </w:rPr>
               <w:lastRenderedPageBreak/>
               <w:drawing>
@@ -30623,6 +30773,7 @@
   <w:style w:type="character" w:default="1" w:styleId="Fontepargpadro">
     <w:name w:val="Default Paragraph Font"/>
     <w:uiPriority w:val="1"/>
+    <w:semiHidden/>
     <w:unhideWhenUsed/>
   </w:style>
   <w:style w:type="table" w:default="1" w:styleId="Tabelanormal">

</xml_diff>

<commit_message>
ajustes em validações e adicionar produtos em procedimentos
</commit_message>
<xml_diff>
--- a/ERS/ERS - Meuatrix.docx
+++ b/ERS/ERS - Meuatrix.docx
@@ -4487,10 +4487,10 @@
       </w:tblPr>
       <w:tblGrid>
         <w:gridCol w:w="752"/>
-        <w:gridCol w:w="3940"/>
-        <w:gridCol w:w="1001"/>
-        <w:gridCol w:w="2522"/>
-        <w:gridCol w:w="1412"/>
+        <w:gridCol w:w="3927"/>
+        <w:gridCol w:w="1026"/>
+        <w:gridCol w:w="2514"/>
+        <w:gridCol w:w="1408"/>
       </w:tblGrid>
       <w:tr>
         <w:trPr>
@@ -4754,6 +4754,12 @@
                 <w:rFonts w:asciiTheme="minorHAnsi" w:hAnsiTheme="minorHAnsi" w:cstheme="minorHAnsi"/>
               </w:rPr>
             </w:pPr>
+            <w:r>
+              <w:rPr>
+                <w:rFonts w:asciiTheme="minorHAnsi" w:hAnsiTheme="minorHAnsi" w:cstheme="minorHAnsi"/>
+              </w:rPr>
+              <w:t>Descrição duplicada</w:t>
+            </w:r>
           </w:p>
         </w:tc>
         <w:tc>
@@ -4771,7 +4777,13 @@
               <w:rPr>
                 <w:rFonts w:asciiTheme="minorHAnsi" w:hAnsiTheme="minorHAnsi" w:cstheme="minorHAnsi"/>
               </w:rPr>
-              <w:t>S2</w:t>
+              <w:t>S</w:t>
+            </w:r>
+            <w:r>
+              <w:rPr>
+                <w:rFonts w:asciiTheme="minorHAnsi" w:hAnsiTheme="minorHAnsi" w:cstheme="minorHAnsi"/>
+              </w:rPr>
+              <w:t>3</w:t>
             </w:r>
           </w:p>
         </w:tc>
@@ -4904,41 +4916,14 @@
               <w:rPr>
                 <w:rFonts w:asciiTheme="minorHAnsi" w:hAnsiTheme="minorHAnsi" w:cstheme="minorHAnsi"/>
               </w:rPr>
+              <w:t>Descrição duplicada</w:t>
+            </w:r>
+            <w:r>
+              <w:rPr>
+                <w:rFonts w:asciiTheme="minorHAnsi" w:hAnsiTheme="minorHAnsi" w:cstheme="minorHAnsi"/>
+              </w:rPr>
+              <w:br/>
               <w:t>Erro ao gravar</w:t>
-            </w:r>
-            <w:r>
-              <w:rPr>
-                <w:rFonts w:asciiTheme="minorHAnsi" w:hAnsiTheme="minorHAnsi" w:cstheme="minorHAnsi"/>
-              </w:rPr>
-              <w:br/>
-            </w:r>
-            <w:proofErr w:type="spellStart"/>
-            <w:r>
-              <w:rPr>
-                <w:rFonts w:asciiTheme="minorHAnsi" w:hAnsiTheme="minorHAnsi" w:cstheme="minorHAnsi"/>
-              </w:rPr>
-              <w:t>Invalid</w:t>
-            </w:r>
-            <w:proofErr w:type="spellEnd"/>
-            <w:r>
-              <w:rPr>
-                <w:rFonts w:asciiTheme="minorHAnsi" w:hAnsiTheme="minorHAnsi" w:cstheme="minorHAnsi"/>
-              </w:rPr>
-              <w:t xml:space="preserve"> input</w:t>
-            </w:r>
-            <w:r>
-              <w:rPr>
-                <w:rFonts w:asciiTheme="minorHAnsi" w:hAnsiTheme="minorHAnsi" w:cstheme="minorHAnsi"/>
-              </w:rPr>
-              <w:br/>
-              <w:t>Campos obrigatórios</w:t>
-            </w:r>
-            <w:r>
-              <w:rPr>
-                <w:rFonts w:asciiTheme="minorHAnsi" w:hAnsiTheme="minorHAnsi" w:cstheme="minorHAnsi"/>
-              </w:rPr>
-              <w:br/>
-              <w:t>Não duplicar descrição</w:t>
             </w:r>
           </w:p>
         </w:tc>
@@ -4957,7 +4942,13 @@
               <w:rPr>
                 <w:rFonts w:asciiTheme="minorHAnsi" w:hAnsiTheme="minorHAnsi" w:cstheme="minorHAnsi"/>
               </w:rPr>
-              <w:t>S2</w:t>
+              <w:t>S</w:t>
+            </w:r>
+            <w:r>
+              <w:rPr>
+                <w:rFonts w:asciiTheme="minorHAnsi" w:hAnsiTheme="minorHAnsi" w:cstheme="minorHAnsi"/>
+              </w:rPr>
+              <w:t>3</w:t>
             </w:r>
           </w:p>
         </w:tc>
@@ -5073,26 +5064,11 @@
                 <w:rFonts w:asciiTheme="minorHAnsi" w:hAnsiTheme="minorHAnsi" w:cstheme="minorHAnsi"/>
               </w:rPr>
             </w:pPr>
-            <w:proofErr w:type="spellStart"/>
-            <w:r>
-              <w:rPr>
-                <w:rFonts w:asciiTheme="minorHAnsi" w:hAnsiTheme="minorHAnsi" w:cstheme="minorHAnsi"/>
-              </w:rPr>
-              <w:t>Invalid</w:t>
-            </w:r>
-            <w:proofErr w:type="spellEnd"/>
-            <w:r>
-              <w:rPr>
-                <w:rFonts w:asciiTheme="minorHAnsi" w:hAnsiTheme="minorHAnsi" w:cstheme="minorHAnsi"/>
-              </w:rPr>
-              <w:t xml:space="preserve"> input</w:t>
-            </w:r>
-            <w:r>
-              <w:rPr>
-                <w:rFonts w:asciiTheme="minorHAnsi" w:hAnsiTheme="minorHAnsi" w:cstheme="minorHAnsi"/>
-              </w:rPr>
-              <w:br/>
-              <w:t>Campos obrigatórios</w:t>
+            <w:r>
+              <w:rPr>
+                <w:rFonts w:asciiTheme="minorHAnsi" w:hAnsiTheme="minorHAnsi" w:cstheme="minorHAnsi"/>
+              </w:rPr>
+              <w:t>Sigla duplicada</w:t>
             </w:r>
             <w:r>
               <w:rPr>
@@ -5117,7 +5093,13 @@
               <w:rPr>
                 <w:rFonts w:asciiTheme="minorHAnsi" w:hAnsiTheme="minorHAnsi" w:cstheme="minorHAnsi"/>
               </w:rPr>
-              <w:t>S2</w:t>
+              <w:t>S</w:t>
+            </w:r>
+            <w:r>
+              <w:rPr>
+                <w:rFonts w:asciiTheme="minorHAnsi" w:hAnsiTheme="minorHAnsi" w:cstheme="minorHAnsi"/>
+              </w:rPr>
+              <w:t>3</w:t>
             </w:r>
           </w:p>
         </w:tc>
@@ -5240,26 +5222,11 @@
                 <w:rFonts w:asciiTheme="minorHAnsi" w:hAnsiTheme="minorHAnsi" w:cstheme="minorHAnsi"/>
               </w:rPr>
             </w:pPr>
-            <w:proofErr w:type="spellStart"/>
-            <w:r>
-              <w:rPr>
-                <w:rFonts w:asciiTheme="minorHAnsi" w:hAnsiTheme="minorHAnsi" w:cstheme="minorHAnsi"/>
-              </w:rPr>
-              <w:t>Invalid</w:t>
-            </w:r>
-            <w:proofErr w:type="spellEnd"/>
-            <w:r>
-              <w:rPr>
-                <w:rFonts w:asciiTheme="minorHAnsi" w:hAnsiTheme="minorHAnsi" w:cstheme="minorHAnsi"/>
-              </w:rPr>
-              <w:t xml:space="preserve"> input</w:t>
-            </w:r>
-            <w:r>
-              <w:rPr>
-                <w:rFonts w:asciiTheme="minorHAnsi" w:hAnsiTheme="minorHAnsi" w:cstheme="minorHAnsi"/>
-              </w:rPr>
-              <w:br/>
-              <w:t>Campos obrigatórios</w:t>
+            <w:r>
+              <w:rPr>
+                <w:rFonts w:asciiTheme="minorHAnsi" w:hAnsiTheme="minorHAnsi" w:cstheme="minorHAnsi"/>
+              </w:rPr>
+              <w:t>Nome duplicado</w:t>
             </w:r>
           </w:p>
         </w:tc>
@@ -5278,7 +5245,13 @@
               <w:rPr>
                 <w:rFonts w:asciiTheme="minorHAnsi" w:hAnsiTheme="minorHAnsi" w:cstheme="minorHAnsi"/>
               </w:rPr>
-              <w:t>S2</w:t>
+              <w:t>S</w:t>
+            </w:r>
+            <w:r>
+              <w:rPr>
+                <w:rFonts w:asciiTheme="minorHAnsi" w:hAnsiTheme="minorHAnsi" w:cstheme="minorHAnsi"/>
+              </w:rPr>
+              <w:t>3</w:t>
             </w:r>
           </w:p>
         </w:tc>
@@ -5398,40 +5371,7 @@
               <w:rPr>
                 <w:rFonts w:asciiTheme="minorHAnsi" w:hAnsiTheme="minorHAnsi" w:cstheme="minorHAnsi"/>
               </w:rPr>
-              <w:br/>
-            </w:r>
-            <w:proofErr w:type="spellStart"/>
-            <w:r>
-              <w:rPr>
-                <w:rFonts w:asciiTheme="minorHAnsi" w:hAnsiTheme="minorHAnsi" w:cstheme="minorHAnsi"/>
-              </w:rPr>
-              <w:t>Invalid</w:t>
-            </w:r>
-            <w:proofErr w:type="spellEnd"/>
-            <w:r>
-              <w:rPr>
-                <w:rFonts w:asciiTheme="minorHAnsi" w:hAnsiTheme="minorHAnsi" w:cstheme="minorHAnsi"/>
-              </w:rPr>
-              <w:t xml:space="preserve"> input</w:t>
-            </w:r>
-            <w:r>
-              <w:rPr>
-                <w:rFonts w:asciiTheme="minorHAnsi" w:hAnsiTheme="minorHAnsi" w:cstheme="minorHAnsi"/>
-              </w:rPr>
-              <w:br/>
-              <w:t>Campos obrigatórios</w:t>
-            </w:r>
-            <w:r>
-              <w:rPr>
-                <w:rFonts w:asciiTheme="minorHAnsi" w:hAnsiTheme="minorHAnsi" w:cstheme="minorHAnsi"/>
-              </w:rPr>
-              <w:br/>
-            </w:r>
-            <w:r>
-              <w:rPr>
-                <w:rFonts w:asciiTheme="minorHAnsi" w:hAnsiTheme="minorHAnsi" w:cstheme="minorHAnsi"/>
-              </w:rPr>
-              <w:t>Validar CNPJ</w:t>
+              <w:t>CNPJ válido</w:t>
             </w:r>
           </w:p>
         </w:tc>
@@ -5450,7 +5390,13 @@
               <w:rPr>
                 <w:rFonts w:asciiTheme="minorHAnsi" w:hAnsiTheme="minorHAnsi" w:cstheme="minorHAnsi"/>
               </w:rPr>
-              <w:t>S2</w:t>
+              <w:t>S</w:t>
+            </w:r>
+            <w:r>
+              <w:rPr>
+                <w:rFonts w:asciiTheme="minorHAnsi" w:hAnsiTheme="minorHAnsi" w:cstheme="minorHAnsi"/>
+              </w:rPr>
+              <w:t>3</w:t>
             </w:r>
           </w:p>
         </w:tc>
@@ -5566,33 +5512,11 @@
                 <w:rFonts w:asciiTheme="minorHAnsi" w:hAnsiTheme="minorHAnsi" w:cstheme="minorHAnsi"/>
               </w:rPr>
             </w:pPr>
-            <w:proofErr w:type="spellStart"/>
-            <w:r>
-              <w:rPr>
-                <w:rFonts w:asciiTheme="minorHAnsi" w:hAnsiTheme="minorHAnsi" w:cstheme="minorHAnsi"/>
-              </w:rPr>
-              <w:t>Invalid</w:t>
-            </w:r>
-            <w:proofErr w:type="spellEnd"/>
-            <w:r>
-              <w:rPr>
-                <w:rFonts w:asciiTheme="minorHAnsi" w:hAnsiTheme="minorHAnsi" w:cstheme="minorHAnsi"/>
-              </w:rPr>
-              <w:t xml:space="preserve"> input</w:t>
-            </w:r>
-            <w:r>
-              <w:rPr>
-                <w:rFonts w:asciiTheme="minorHAnsi" w:hAnsiTheme="minorHAnsi" w:cstheme="minorHAnsi"/>
-              </w:rPr>
-              <w:br/>
-              <w:t>Campos obrigatórios</w:t>
-            </w:r>
-            <w:r>
-              <w:rPr>
-                <w:rFonts w:asciiTheme="minorHAnsi" w:hAnsiTheme="minorHAnsi" w:cstheme="minorHAnsi"/>
-              </w:rPr>
-              <w:br/>
-              <w:t>Novos campos</w:t>
+            <w:r>
+              <w:rPr>
+                <w:rFonts w:asciiTheme="minorHAnsi" w:hAnsiTheme="minorHAnsi" w:cstheme="minorHAnsi"/>
+              </w:rPr>
+              <w:t>Máscara de CEP</w:t>
             </w:r>
           </w:p>
         </w:tc>
@@ -5611,7 +5535,13 @@
               <w:rPr>
                 <w:rFonts w:asciiTheme="minorHAnsi" w:hAnsiTheme="minorHAnsi" w:cstheme="minorHAnsi"/>
               </w:rPr>
-              <w:t>S2</w:t>
+              <w:t>S</w:t>
+            </w:r>
+            <w:r>
+              <w:rPr>
+                <w:rFonts w:asciiTheme="minorHAnsi" w:hAnsiTheme="minorHAnsi" w:cstheme="minorHAnsi"/>
+              </w:rPr>
+              <w:t>3</w:t>
             </w:r>
           </w:p>
         </w:tc>
@@ -5712,7 +5642,7 @@
               <w:rPr>
                 <w:rFonts w:asciiTheme="minorHAnsi" w:hAnsiTheme="minorHAnsi" w:cstheme="minorHAnsi"/>
               </w:rPr>
-              <w:t>Pendente</w:t>
+              <w:t>Concluído</w:t>
             </w:r>
           </w:p>
         </w:tc>
@@ -5739,13 +5669,7 @@
               <w:rPr>
                 <w:rFonts w:asciiTheme="minorHAnsi" w:hAnsiTheme="minorHAnsi" w:cstheme="minorHAnsi"/>
               </w:rPr>
-              <w:t xml:space="preserve"> </w:t>
-            </w:r>
-            <w:r>
-              <w:rPr>
-                <w:rFonts w:asciiTheme="minorHAnsi" w:hAnsiTheme="minorHAnsi" w:cstheme="minorHAnsi"/>
-              </w:rPr>
-              <w:t>input</w:t>
+              <w:t xml:space="preserve"> input</w:t>
             </w:r>
             <w:r>
               <w:rPr>
@@ -5771,7 +5695,13 @@
               <w:rPr>
                 <w:rFonts w:asciiTheme="minorHAnsi" w:hAnsiTheme="minorHAnsi" w:cstheme="minorHAnsi"/>
               </w:rPr>
-              <w:t>S1</w:t>
+              <w:t>S</w:t>
+            </w:r>
+            <w:r>
+              <w:rPr>
+                <w:rFonts w:asciiTheme="minorHAnsi" w:hAnsiTheme="minorHAnsi" w:cstheme="minorHAnsi"/>
+              </w:rPr>
+              <w:t>2</w:t>
             </w:r>
           </w:p>
         </w:tc>
@@ -5898,7 +5828,14 @@
               <w:rPr>
                 <w:rFonts w:asciiTheme="minorHAnsi" w:hAnsiTheme="minorHAnsi" w:cstheme="minorHAnsi"/>
               </w:rPr>
-              <w:t>Validações sobre datas e quantidades</w:t>
+              <w:t>Data de aquisição podendo ser futura</w:t>
+            </w:r>
+            <w:r>
+              <w:rPr>
+                <w:rFonts w:asciiTheme="minorHAnsi" w:hAnsiTheme="minorHAnsi" w:cstheme="minorHAnsi"/>
+              </w:rPr>
+              <w:br/>
+              <w:t>Valor de saída maior que o valor atual</w:t>
             </w:r>
           </w:p>
         </w:tc>
@@ -5917,7 +5854,13 @@
               <w:rPr>
                 <w:rFonts w:asciiTheme="minorHAnsi" w:hAnsiTheme="minorHAnsi" w:cstheme="minorHAnsi"/>
               </w:rPr>
-              <w:t>S2</w:t>
+              <w:t>S</w:t>
+            </w:r>
+            <w:r>
+              <w:rPr>
+                <w:rFonts w:asciiTheme="minorHAnsi" w:hAnsiTheme="minorHAnsi" w:cstheme="minorHAnsi"/>
+              </w:rPr>
+              <w:t>3</w:t>
             </w:r>
           </w:p>
         </w:tc>
@@ -10156,7 +10099,7 @@
                 <w:sz w:val="22"/>
               </w:rPr>
               <w:drawing>
-                <wp:inline distT="0" distB="0" distL="0" distR="0" wp14:anchorId="5D21E18F" wp14:editId="6A6D0313">
+                <wp:inline distT="0" distB="0" distL="0" distR="0" wp14:anchorId="5D21E18F" wp14:editId="105E12D0">
                   <wp:extent cx="5424308" cy="2562861"/>
                   <wp:effectExtent l="0" t="0" r="5080" b="8890"/>
                   <wp:docPr id="1409173747" name="Imagem 5"/>
@@ -12473,7 +12416,7 @@
                 <w:noProof/>
               </w:rPr>
               <w:drawing>
-                <wp:inline distT="0" distB="0" distL="0" distR="0" wp14:anchorId="7292B2C4" wp14:editId="4281036B">
+                <wp:inline distT="0" distB="0" distL="0" distR="0" wp14:anchorId="7292B2C4" wp14:editId="31AE8CD8">
                   <wp:extent cx="5343821" cy="2498763"/>
                   <wp:effectExtent l="0" t="0" r="9525" b="0"/>
                   <wp:docPr id="2011314755" name="Imagem 5"/>
@@ -14605,7 +14548,7 @@
                 <w:noProof/>
               </w:rPr>
               <w:drawing>
-                <wp:inline distT="0" distB="0" distL="0" distR="0" wp14:anchorId="335E3FD6" wp14:editId="357AC915">
+                <wp:inline distT="0" distB="0" distL="0" distR="0" wp14:anchorId="335E3FD6" wp14:editId="20BDF00B">
                   <wp:extent cx="5946233" cy="2406484"/>
                   <wp:effectExtent l="0" t="0" r="0" b="0"/>
                   <wp:docPr id="32953469" name="Imagem 6"/>
@@ -16940,7 +16883,7 @@
                 <w:noProof/>
               </w:rPr>
               <w:drawing>
-                <wp:inline distT="0" distB="0" distL="0" distR="0" wp14:anchorId="7568263A" wp14:editId="7BA2F415">
+                <wp:inline distT="0" distB="0" distL="0" distR="0" wp14:anchorId="7568263A" wp14:editId="05B23593">
                   <wp:extent cx="5517374" cy="3180604"/>
                   <wp:effectExtent l="0" t="0" r="7620" b="1270"/>
                   <wp:docPr id="560826634" name="Imagem 5"/>
@@ -20417,7 +20360,7 @@
                 <w:sz w:val="22"/>
               </w:rPr>
               <w:drawing>
-                <wp:inline distT="0" distB="0" distL="0" distR="0" wp14:anchorId="187DB160" wp14:editId="78BCBCC6">
+                <wp:inline distT="0" distB="0" distL="0" distR="0" wp14:anchorId="187DB160" wp14:editId="55C51B39">
                   <wp:extent cx="5502303" cy="2119389"/>
                   <wp:effectExtent l="0" t="0" r="3175" b="0"/>
                   <wp:docPr id="1892549414" name="Imagem 5"/>
@@ -22156,7 +22099,7 @@
                 <w:sz w:val="22"/>
               </w:rPr>
               <w:drawing>
-                <wp:inline distT="0" distB="0" distL="0" distR="0" wp14:anchorId="49AEA879" wp14:editId="53302308">
+                <wp:inline distT="0" distB="0" distL="0" distR="0" wp14:anchorId="49AEA879" wp14:editId="2E322BBF">
                   <wp:extent cx="5316368" cy="3422512"/>
                   <wp:effectExtent l="0" t="0" r="0" b="6985"/>
                   <wp:docPr id="1264191746" name="Imagem 7"/>

</xml_diff>

<commit_message>
ajuste de funções fundamentais
</commit_message>
<xml_diff>
--- a/ERS/ERS - Meuatrix.docx
+++ b/ERS/ERS - Meuatrix.docx
@@ -4487,10 +4487,10 @@
       </w:tblPr>
       <w:tblGrid>
         <w:gridCol w:w="752"/>
-        <w:gridCol w:w="3927"/>
-        <w:gridCol w:w="1026"/>
-        <w:gridCol w:w="2514"/>
-        <w:gridCol w:w="1408"/>
+        <w:gridCol w:w="3940"/>
+        <w:gridCol w:w="1001"/>
+        <w:gridCol w:w="2522"/>
+        <w:gridCol w:w="1412"/>
       </w:tblGrid>
       <w:tr>
         <w:trPr>
@@ -5373,6 +5373,13 @@
               </w:rPr>
               <w:t>CNPJ válido</w:t>
             </w:r>
+            <w:r>
+              <w:rPr>
+                <w:rFonts w:asciiTheme="minorHAnsi" w:hAnsiTheme="minorHAnsi" w:cstheme="minorHAnsi"/>
+              </w:rPr>
+              <w:br/>
+              <w:t>Razão social duplicada</w:t>
+            </w:r>
           </w:p>
         </w:tc>
         <w:tc>
@@ -5642,7 +5649,7 @@
               <w:rPr>
                 <w:rFonts w:asciiTheme="minorHAnsi" w:hAnsiTheme="minorHAnsi" w:cstheme="minorHAnsi"/>
               </w:rPr>
-              <w:t>Concluído</w:t>
+              <w:t>Pendente</w:t>
             </w:r>
           </w:p>
         </w:tc>
@@ -6921,6 +6928,12 @@
                 <w:rFonts w:cstheme="minorHAnsi"/>
               </w:rPr>
             </w:pPr>
+            <w:r>
+              <w:rPr>
+                <w:rFonts w:asciiTheme="minorHAnsi" w:hAnsiTheme="minorHAnsi" w:cstheme="minorHAnsi"/>
+              </w:rPr>
+              <w:t>Pendente</w:t>
+            </w:r>
           </w:p>
         </w:tc>
         <w:tc>
@@ -10099,7 +10112,7 @@
                 <w:sz w:val="22"/>
               </w:rPr>
               <w:drawing>
-                <wp:inline distT="0" distB="0" distL="0" distR="0" wp14:anchorId="5D21E18F" wp14:editId="105E12D0">
+                <wp:inline distT="0" distB="0" distL="0" distR="0" wp14:anchorId="5D21E18F" wp14:editId="721FB43B">
                   <wp:extent cx="5424308" cy="2562861"/>
                   <wp:effectExtent l="0" t="0" r="5080" b="8890"/>
                   <wp:docPr id="1409173747" name="Imagem 5"/>
@@ -12416,7 +12429,7 @@
                 <w:noProof/>
               </w:rPr>
               <w:drawing>
-                <wp:inline distT="0" distB="0" distL="0" distR="0" wp14:anchorId="7292B2C4" wp14:editId="31AE8CD8">
+                <wp:inline distT="0" distB="0" distL="0" distR="0" wp14:anchorId="7292B2C4" wp14:editId="64217202">
                   <wp:extent cx="5343821" cy="2498763"/>
                   <wp:effectExtent l="0" t="0" r="9525" b="0"/>
                   <wp:docPr id="2011314755" name="Imagem 5"/>
@@ -14548,7 +14561,7 @@
                 <w:noProof/>
               </w:rPr>
               <w:drawing>
-                <wp:inline distT="0" distB="0" distL="0" distR="0" wp14:anchorId="335E3FD6" wp14:editId="20BDF00B">
+                <wp:inline distT="0" distB="0" distL="0" distR="0" wp14:anchorId="335E3FD6" wp14:editId="7B617063">
                   <wp:extent cx="5946233" cy="2406484"/>
                   <wp:effectExtent l="0" t="0" r="0" b="0"/>
                   <wp:docPr id="32953469" name="Imagem 6"/>
@@ -16883,7 +16896,7 @@
                 <w:noProof/>
               </w:rPr>
               <w:drawing>
-                <wp:inline distT="0" distB="0" distL="0" distR="0" wp14:anchorId="7568263A" wp14:editId="05B23593">
+                <wp:inline distT="0" distB="0" distL="0" distR="0" wp14:anchorId="7568263A" wp14:editId="45A23894">
                   <wp:extent cx="5517374" cy="3180604"/>
                   <wp:effectExtent l="0" t="0" r="7620" b="1270"/>
                   <wp:docPr id="560826634" name="Imagem 5"/>
@@ -20360,7 +20373,7 @@
                 <w:sz w:val="22"/>
               </w:rPr>
               <w:drawing>
-                <wp:inline distT="0" distB="0" distL="0" distR="0" wp14:anchorId="187DB160" wp14:editId="55C51B39">
+                <wp:inline distT="0" distB="0" distL="0" distR="0" wp14:anchorId="187DB160" wp14:editId="7C683ABC">
                   <wp:extent cx="5502303" cy="2119389"/>
                   <wp:effectExtent l="0" t="0" r="3175" b="0"/>
                   <wp:docPr id="1892549414" name="Imagem 5"/>
@@ -21431,41 +21444,6 @@
                 <w:sz w:val="22"/>
                 <w:szCs w:val="22"/>
               </w:rPr>
-              <w:t>ite_quantidade_saida_alterada</w:t>
-            </w:r>
-            <w:proofErr w:type="spellEnd"/>
-            <w:r>
-              <w:rPr>
-                <w:rFonts w:asciiTheme="minorHAnsi" w:hAnsiTheme="minorHAnsi" w:cstheme="minorHAnsi"/>
-                <w:bCs/>
-                <w:sz w:val="22"/>
-                <w:szCs w:val="22"/>
-              </w:rPr>
-              <w:t>: quantidade informada manualmente pelo operador quando este ajusta a quantidade padrão consumida do item no momento da baixa;</w:t>
-            </w:r>
-          </w:p>
-          <w:p>
-            <w:pPr>
-              <w:numPr>
-                <w:ilvl w:val="0"/>
-                <w:numId w:val="51"/>
-              </w:numPr>
-              <w:spacing w:before="240"/>
-              <w:rPr>
-                <w:rFonts w:asciiTheme="minorHAnsi" w:hAnsiTheme="minorHAnsi" w:cstheme="minorHAnsi"/>
-                <w:bCs/>
-                <w:sz w:val="22"/>
-                <w:szCs w:val="22"/>
-              </w:rPr>
-            </w:pPr>
-            <w:proofErr w:type="spellStart"/>
-            <w:r>
-              <w:rPr>
-                <w:rFonts w:asciiTheme="minorHAnsi" w:hAnsiTheme="minorHAnsi" w:cstheme="minorHAnsi"/>
-                <w:bCs/>
-                <w:sz w:val="22"/>
-                <w:szCs w:val="22"/>
-              </w:rPr>
               <w:t>ite_lote_nome</w:t>
             </w:r>
             <w:proofErr w:type="spellEnd"/>
@@ -21761,7 +21739,6 @@
                 <w:sz w:val="22"/>
                 <w:szCs w:val="22"/>
               </w:rPr>
-              <w:lastRenderedPageBreak/>
               <w:t xml:space="preserve">A consulta deve apresentar, no mínimo, o nome do item, o produto vinculado, a quantidade atual, o lote e a situação. </w:t>
             </w:r>
           </w:p>
@@ -21787,6 +21764,7 @@
                 <w:sz w:val="22"/>
                 <w:szCs w:val="22"/>
               </w:rPr>
+              <w:lastRenderedPageBreak/>
               <w:t xml:space="preserve">Itens inativos devem permanecer disponíveis para consulta, sendo identificados visualmente como inativos. </w:t>
             </w:r>
           </w:p>
@@ -22099,7 +22077,7 @@
                 <w:sz w:val="22"/>
               </w:rPr>
               <w:drawing>
-                <wp:inline distT="0" distB="0" distL="0" distR="0" wp14:anchorId="49AEA879" wp14:editId="2E322BBF">
+                <wp:inline distT="0" distB="0" distL="0" distR="0" wp14:anchorId="49AEA879" wp14:editId="6A2A861F">
                   <wp:extent cx="5316368" cy="3422512"/>
                   <wp:effectExtent l="0" t="0" r="0" b="6985"/>
                   <wp:docPr id="1264191746" name="Imagem 7"/>
@@ -22608,6 +22586,279 @@
           </w:p>
         </w:tc>
       </w:tr>
+      <w:tr>
+        <w:tc>
+          <w:tcPr>
+            <w:tcW w:w="9627" w:type="dxa"/>
+          </w:tcPr>
+          <w:p>
+            <w:pPr>
+              <w:spacing w:before="240"/>
+              <w:rPr>
+                <w:rFonts w:asciiTheme="minorHAnsi" w:hAnsiTheme="minorHAnsi" w:cstheme="minorHAnsi"/>
+                <w:b/>
+                <w:sz w:val="22"/>
+                <w:szCs w:val="22"/>
+              </w:rPr>
+            </w:pPr>
+            <w:r>
+              <w:rPr>
+                <w:rFonts w:asciiTheme="minorHAnsi" w:hAnsiTheme="minorHAnsi" w:cstheme="minorHAnsi"/>
+                <w:b/>
+                <w:sz w:val="22"/>
+                <w:szCs w:val="22"/>
+              </w:rPr>
+              <w:lastRenderedPageBreak/>
+              <w:t xml:space="preserve">Estória </w:t>
+            </w:r>
+            <w:r>
+              <w:rPr>
+                <w:rFonts w:asciiTheme="minorHAnsi" w:hAnsiTheme="minorHAnsi" w:cstheme="minorHAnsi"/>
+                <w:b/>
+                <w:sz w:val="22"/>
+                <w:szCs w:val="22"/>
+              </w:rPr>
+              <w:t>9</w:t>
+            </w:r>
+            <w:r>
+              <w:rPr>
+                <w:rFonts w:asciiTheme="minorHAnsi" w:hAnsiTheme="minorHAnsi" w:cstheme="minorHAnsi"/>
+                <w:b/>
+                <w:sz w:val="22"/>
+                <w:szCs w:val="22"/>
+              </w:rPr>
+              <w:t xml:space="preserve">: </w:t>
+            </w:r>
+            <w:r>
+              <w:rPr>
+                <w:rFonts w:asciiTheme="minorHAnsi" w:hAnsiTheme="minorHAnsi" w:cstheme="minorHAnsi"/>
+                <w:b/>
+                <w:sz w:val="22"/>
+                <w:szCs w:val="22"/>
+              </w:rPr>
+              <w:t xml:space="preserve">Associar itens aos procedimentos </w:t>
+            </w:r>
+            <w:r>
+              <w:rPr>
+                <w:rFonts w:asciiTheme="minorHAnsi" w:hAnsiTheme="minorHAnsi" w:cstheme="minorHAnsi"/>
+                <w:b/>
+                <w:sz w:val="22"/>
+                <w:szCs w:val="22"/>
+              </w:rPr>
+              <w:t>(RF_</w:t>
+            </w:r>
+            <w:r>
+              <w:rPr>
+                <w:rFonts w:asciiTheme="minorHAnsi" w:hAnsiTheme="minorHAnsi" w:cstheme="minorHAnsi"/>
+                <w:b/>
+                <w:sz w:val="22"/>
+                <w:szCs w:val="22"/>
+              </w:rPr>
+              <w:t>Fx</w:t>
+            </w:r>
+            <w:r>
+              <w:rPr>
+                <w:rFonts w:asciiTheme="minorHAnsi" w:hAnsiTheme="minorHAnsi" w:cstheme="minorHAnsi"/>
+                <w:b/>
+                <w:sz w:val="22"/>
+                <w:szCs w:val="22"/>
+              </w:rPr>
+              <w:t>)</w:t>
+            </w:r>
+          </w:p>
+          <w:p>
+            <w:pPr>
+              <w:spacing w:before="240"/>
+              <w:rPr>
+                <w:rFonts w:asciiTheme="minorHAnsi" w:hAnsiTheme="minorHAnsi" w:cstheme="minorHAnsi"/>
+                <w:bCs/>
+                <w:sz w:val="22"/>
+                <w:szCs w:val="22"/>
+              </w:rPr>
+            </w:pPr>
+          </w:p>
+        </w:tc>
+      </w:tr>
+      <w:tr>
+        <w:tc>
+          <w:tcPr>
+            <w:tcW w:w="9627" w:type="dxa"/>
+          </w:tcPr>
+          <w:p>
+            <w:pPr>
+              <w:spacing w:before="240"/>
+              <w:rPr>
+                <w:rFonts w:asciiTheme="minorHAnsi" w:hAnsiTheme="minorHAnsi" w:cstheme="minorHAnsi"/>
+                <w:b/>
+                <w:sz w:val="22"/>
+                <w:szCs w:val="22"/>
+              </w:rPr>
+            </w:pPr>
+            <w:r>
+              <w:rPr>
+                <w:rFonts w:asciiTheme="minorHAnsi" w:hAnsiTheme="minorHAnsi" w:cstheme="minorHAnsi"/>
+                <w:b/>
+                <w:sz w:val="22"/>
+                <w:szCs w:val="22"/>
+              </w:rPr>
+              <w:lastRenderedPageBreak/>
+              <w:t>Especificação do Requisito</w:t>
+            </w:r>
+          </w:p>
+          <w:p>
+            <w:pPr>
+              <w:spacing w:before="240"/>
+              <w:rPr>
+                <w:rFonts w:asciiTheme="minorHAnsi" w:hAnsiTheme="minorHAnsi" w:cstheme="minorHAnsi"/>
+                <w:b/>
+                <w:sz w:val="22"/>
+                <w:szCs w:val="22"/>
+              </w:rPr>
+            </w:pPr>
+            <w:r>
+              <w:rPr>
+                <w:rFonts w:asciiTheme="minorHAnsi" w:hAnsiTheme="minorHAnsi" w:cstheme="minorHAnsi"/>
+                <w:b/>
+                <w:sz w:val="22"/>
+                <w:szCs w:val="22"/>
+              </w:rPr>
+              <w:t>Diagrama de Classe do Context</w:t>
+            </w:r>
+            <w:r>
+              <w:rPr>
+                <w:rFonts w:asciiTheme="minorHAnsi" w:hAnsiTheme="minorHAnsi" w:cstheme="minorHAnsi"/>
+                <w:b/>
+                <w:sz w:val="22"/>
+                <w:szCs w:val="22"/>
+              </w:rPr>
+              <w:t>o</w:t>
+            </w:r>
+          </w:p>
+          <w:p>
+            <w:pPr>
+              <w:pStyle w:val="Exemplo"/>
+              <w:numPr>
+                <w:ilvl w:val="0"/>
+                <w:numId w:val="0"/>
+              </w:numPr>
+              <w:spacing w:before="240"/>
+              <w:ind w:left="720" w:hanging="360"/>
+              <w:jc w:val="center"/>
+              <w:rPr>
+                <w:rFonts w:asciiTheme="minorHAnsi" w:hAnsiTheme="minorHAnsi" w:cstheme="minorHAnsi"/>
+                <w:sz w:val="22"/>
+                <w:szCs w:val="22"/>
+              </w:rPr>
+            </w:pPr>
+          </w:p>
+          <w:p>
+            <w:pPr>
+              <w:pStyle w:val="Exemplo"/>
+              <w:numPr>
+                <w:ilvl w:val="0"/>
+                <w:numId w:val="0"/>
+              </w:numPr>
+              <w:spacing w:before="240"/>
+              <w:ind w:left="720" w:hanging="360"/>
+              <w:jc w:val="center"/>
+              <w:rPr>
+                <w:rFonts w:asciiTheme="minorHAnsi" w:hAnsiTheme="minorHAnsi" w:cstheme="minorHAnsi"/>
+                <w:sz w:val="22"/>
+                <w:szCs w:val="22"/>
+              </w:rPr>
+            </w:pPr>
+          </w:p>
+          <w:p>
+            <w:pPr>
+              <w:spacing w:before="240"/>
+              <w:rPr>
+                <w:rFonts w:asciiTheme="minorHAnsi" w:hAnsiTheme="minorHAnsi" w:cstheme="minorHAnsi"/>
+                <w:b/>
+                <w:sz w:val="22"/>
+                <w:szCs w:val="22"/>
+              </w:rPr>
+            </w:pPr>
+            <w:r>
+              <w:rPr>
+                <w:rFonts w:asciiTheme="minorHAnsi" w:hAnsiTheme="minorHAnsi" w:cstheme="minorHAnsi"/>
+                <w:b/>
+                <w:sz w:val="22"/>
+                <w:szCs w:val="22"/>
+              </w:rPr>
+              <w:t>Diagrama de ER do Contexto</w:t>
+            </w:r>
+          </w:p>
+          <w:p>
+            <w:pPr>
+              <w:pStyle w:val="Exemplo"/>
+              <w:numPr>
+                <w:ilvl w:val="0"/>
+                <w:numId w:val="0"/>
+              </w:numPr>
+              <w:spacing w:before="240"/>
+              <w:ind w:left="720" w:hanging="360"/>
+              <w:jc w:val="center"/>
+              <w:rPr>
+                <w:rFonts w:asciiTheme="minorHAnsi" w:hAnsiTheme="minorHAnsi" w:cstheme="minorHAnsi"/>
+                <w:sz w:val="22"/>
+                <w:szCs w:val="22"/>
+              </w:rPr>
+            </w:pPr>
+          </w:p>
+          <w:p>
+            <w:pPr>
+              <w:spacing w:before="240"/>
+              <w:rPr>
+                <w:rFonts w:asciiTheme="minorHAnsi" w:hAnsiTheme="minorHAnsi" w:cstheme="minorHAnsi"/>
+                <w:b/>
+                <w:sz w:val="22"/>
+                <w:szCs w:val="22"/>
+              </w:rPr>
+            </w:pPr>
+            <w:r>
+              <w:rPr>
+                <w:rFonts w:asciiTheme="minorHAnsi" w:hAnsiTheme="minorHAnsi" w:cstheme="minorHAnsi"/>
+                <w:b/>
+                <w:sz w:val="22"/>
+                <w:szCs w:val="22"/>
+              </w:rPr>
+              <w:t xml:space="preserve">Detalhamento com protótipo </w:t>
+            </w:r>
+          </w:p>
+          <w:p>
+            <w:pPr>
+              <w:spacing w:before="240"/>
+              <w:jc w:val="center"/>
+              <w:rPr>
+                <w:rFonts w:asciiTheme="minorHAnsi" w:hAnsiTheme="minorHAnsi" w:cstheme="minorHAnsi"/>
+                <w:bCs/>
+                <w:sz w:val="22"/>
+                <w:szCs w:val="22"/>
+              </w:rPr>
+            </w:pPr>
+            <w:r>
+              <w:rPr>
+                <w:rFonts w:asciiTheme="minorHAnsi" w:hAnsiTheme="minorHAnsi" w:cstheme="minorHAnsi"/>
+                <w:bCs/>
+                <w:sz w:val="22"/>
+                <w:szCs w:val="22"/>
+              </w:rPr>
+              <w:br/>
+            </w:r>
+          </w:p>
+          <w:p>
+            <w:pPr>
+              <w:spacing w:before="240"/>
+              <w:rPr>
+                <w:rFonts w:asciiTheme="minorHAnsi" w:hAnsiTheme="minorHAnsi" w:cstheme="minorHAnsi"/>
+                <w:bCs/>
+                <w:sz w:val="22"/>
+                <w:szCs w:val="22"/>
+              </w:rPr>
+            </w:pPr>
+          </w:p>
+        </w:tc>
+      </w:tr>
     </w:tbl>
     <w:p>
       <w:pPr>
@@ -22714,6 +22965,7 @@
           <w:noProof/>
           <w:lang w:eastAsia="pt-BR"/>
         </w:rPr>
+        <w:lastRenderedPageBreak/>
         <w:drawing>
           <wp:inline distT="0" distB="0" distL="0" distR="0" wp14:anchorId="1B54A1E4" wp14:editId="75B73CCA">
             <wp:extent cx="4777154" cy="2423525"/>

</xml_diff>